<commit_message>
1.4: Anlage-1-Erklärung (§ 3 Nr. 26 EStG) digital statt handschriftlich
Trainer-Formular und Admin-Detail fragen jetzt die Nebentätigkeits-Erklärung
aus Anlage 1 zum Vertrag ab (keine anderen Einnahmen / andere Einnahmen in
bestimmter Höhe) — bislang musste dieser Teil des ausgedruckten Word-Vertrags
von Hand angekreuzt werden. Der generierte Vertrag markiert die passende
Ankreuz-Box automatisch und trägt den Betrag ein, sowohl beim Einzel-Download
als auch im lokalen Stapel-Export (generate-pdfs.ps1).

Enthält außerdem eine bereits lokal in Word vorgenommene Klarstellung im
Pauschale-Absatz (Zahlung 11x im Kalenderjahr, keine Zahlung im Januar).
</commit_message>
<xml_diff>
--- a/vertrag-template.docx
+++ b/vertrag-template.docx
@@ -1069,15 +1069,7 @@
         <w:ind w:left="-14" w:right="455"/>
       </w:pPr>
       <w:r>
-        <w:t xml:space="preserve">Zur pauschalen Abgeltung seines Aufwandes erhält der Übungsleiter eine </w:t>
-      </w:r>
-      <w:proofErr w:type="gramStart"/>
-      <w:r>
-        <w:t>monatliche  Pauschale</w:t>
-      </w:r>
-      <w:proofErr w:type="gramEnd"/>
-      <w:r>
-        <w:t xml:space="preserve"> in Höhe von </w:t>
+        <w:t xml:space="preserve">Zur pauschalen Abgeltung seines Aufwandes erhält der Übungsleiter eine monatliche Pauschale in Höhe von </w:t>
       </w:r>
       <w:r>
         <w:rPr>
@@ -1098,7 +1090,13 @@
         <w:t xml:space="preserve">EUR </w:t>
       </w:r>
       <w:r>
-        <w:t xml:space="preserve">steuerfrei im Rahmen von § 3 Nr. 26 EStG ausgezahlt. </w:t>
+        <w:t>steuerfrei im Rahmen von § 3 Nr. 26 EStG ausgezahlt.</w:t>
+      </w:r>
+      <w:r>
+        <w:t xml:space="preserve"> </w:t>
+      </w:r>
+      <w:r>
+        <w:t>Die Pauschale wird insgesamt 11-mal im Kalenderjahr gezahlt; im Monat Januar erfolgt keine Zahlung.</w:t>
       </w:r>
     </w:p>
     <w:p>
@@ -1175,9 +1173,6 @@
         <w:spacing w:after="0" w:line="259" w:lineRule="auto"/>
         <w:ind w:left="0" w:firstLine="0"/>
       </w:pPr>
-      <w:r>
-        <w:t xml:space="preserve"> </w:t>
-      </w:r>
     </w:p>
     <w:p>
       <w:pPr>
@@ -1372,6 +1367,7 @@
         <w:ind w:left="0" w:firstLine="0"/>
       </w:pPr>
       <w:r>
+        <w:lastRenderedPageBreak/>
         <w:t xml:space="preserve"> </w:t>
       </w:r>
     </w:p>
@@ -1395,7 +1391,6 @@
           <w:b/>
           <w:i/>
         </w:rPr>
-        <w:lastRenderedPageBreak/>
         <w:t>Hinweise  zur</w:t>
       </w:r>
       <w:proofErr w:type="gramEnd"/>
@@ -1660,10 +1655,10 @@
         <w:rPr>
           <w:bdr w:val="single" w:sz="8" w:space="0" w:color="000000"/>
         </w:rPr>
-        <w:t xml:space="preserve">     </w:t>
-      </w:r>
-      <w:r>
-        <w:t xml:space="preserve">      Ich erkläre, dass ich </w:t>
+        <w:t xml:space="preserve">{{CHECK_KEINE}}</w:t>
+      </w:r>
+      <w:r>
+        <w:t xml:space="preserve">    Ich erkläre, dass ich </w:t>
       </w:r>
       <w:r>
         <w:rPr>
@@ -1736,13 +1731,10 @@
         <w:ind w:left="-14" w:right="755"/>
       </w:pPr>
       <w:r>
-        <w:t xml:space="preserve"> </w:t>
-      </w:r>
-      <w:r>
         <w:rPr>
           <w:bdr w:val="single" w:sz="8" w:space="0" w:color="000000"/>
         </w:rPr>
-        <w:t xml:space="preserve">     </w:t>
+        <w:t xml:space="preserve">{{CHECK_ANDERE}}</w:t>
       </w:r>
       <w:r>
         <w:t xml:space="preserve">    Ich erkläre, dass ich Einnahmen aus einer anderen nebenberuflichen Tätigkeit im            Sinne des § 3 Nr. 26 </w:t>
@@ -1753,7 +1745,7 @@
       </w:r>
       <w:proofErr w:type="gramEnd"/>
       <w:r>
-        <w:t xml:space="preserve">z.B. als Übungsleiter/Betreuer für einen anderen Verein)            in Höhe von …………………… in Anspruch genommen habe bzw. in Anspruch            nehmen werde. </w:t>
+        <w:t xml:space="preserve">z.B. als Übungsleiter/Betreuer für einen anderen Verein)            in Höhe von {{NEBENTAETIGKEIT_BETRAG}} in Anspruch genommen habe bzw. in Anspruch            nehmen werde. </w:t>
       </w:r>
     </w:p>
     <w:p>
@@ -2560,7 +2552,6 @@
   <w:style w:type="character" w:default="1" w:styleId="Absatz-Standardschriftart">
     <w:name w:val="Default Paragraph Font"/>
     <w:uiPriority w:val="1"/>
-    <w:semiHidden/>
     <w:unhideWhenUsed/>
   </w:style>
   <w:style w:type="table" w:default="1" w:styleId="NormaleTabelle">

</xml_diff>

<commit_message>
Versionen auf 1.0, Changelog/README konsolidiert, Vertragsvorlage-Whitespace bereinigt
</commit_message>
<xml_diff>
--- a/vertrag-template.docx
+++ b/vertrag-template.docx
@@ -15,16 +15,16 @@
         <mc:AlternateContent>
           <mc:Choice Requires="wpg">
             <w:drawing>
-              <wp:anchor distT="0" distB="0" distL="114300" distR="114300" simplePos="0" relativeHeight="251658240" behindDoc="1" locked="0" layoutInCell="1" allowOverlap="1" wp14:anchorId="59D27CF0" wp14:editId="0949A525">
+              <wp:anchor distT="0" distB="0" distL="114300" distR="114300" simplePos="0" relativeHeight="251658240" behindDoc="1" locked="0" layoutInCell="1" allowOverlap="1" wp14:anchorId="59D27CF0" wp14:editId="312E449D">
                 <wp:simplePos x="0" y="0"/>
                 <wp:positionH relativeFrom="page">
-                  <wp:align>right</wp:align>
+                  <wp:posOffset>1356360</wp:posOffset>
                 </wp:positionH>
                 <wp:positionV relativeFrom="paragraph">
-                  <wp:posOffset>-482600</wp:posOffset>
+                  <wp:posOffset>-457200</wp:posOffset>
                 </wp:positionV>
-                <wp:extent cx="6239256" cy="1336548"/>
-                <wp:effectExtent l="0" t="0" r="28575" b="16510"/>
+                <wp:extent cx="6239256" cy="1348740"/>
+                <wp:effectExtent l="0" t="0" r="28575" b="22860"/>
                 <wp:wrapNone/>
                 <wp:docPr id="3435" name="Group 3435"/>
                 <wp:cNvGraphicFramePr/>
@@ -35,7 +35,7 @@
                       <wpg:grpSpPr>
                         <a:xfrm>
                           <a:off x="0" y="0"/>
-                          <a:ext cx="6239256" cy="1336548"/>
+                          <a:ext cx="6239256" cy="1348740"/>
                           <a:chOff x="0" y="0"/>
                           <a:chExt cx="6239256" cy="1336548"/>
                         </a:xfrm>
@@ -109,12 +109,15 @@
                     </wpg:wgp>
                   </a:graphicData>
                 </a:graphic>
+                <wp14:sizeRelV relativeFrom="margin">
+                  <wp14:pctHeight>0</wp14:pctHeight>
+                </wp14:sizeRelV>
               </wp:anchor>
             </w:drawing>
           </mc:Choice>
           <mc:Fallback>
             <w:pict>
-              <v:group w14:anchorId="70F65F65" id="Group 3435" o:spid="_x0000_s1026" style="position:absolute;margin-left:440.1pt;margin-top:-38pt;width:491.3pt;height:105.25pt;z-index:-251658240;mso-position-horizontal:right;mso-position-horizontal-relative:page" coordsize="62392,13365" o:gfxdata="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">
+              <v:group w14:anchorId="2782D054" id="Group 3435" o:spid="_x0000_s1026" style="position:absolute;margin-left:106.8pt;margin-top:-36pt;width:491.3pt;height:106.2pt;z-index:-251658240;mso-position-horizontal-relative:page;mso-height-relative:margin" coordsize="62392,13365" o:gfxdata="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">
                 <v:shapetype id="_x0000_t75" coordsize="21600,21600" o:spt="75" o:preferrelative="t" path="m@4@5l@4@11@9@11@9@5xe" filled="f" stroked="f">
                   <v:stroke joinstyle="miter"/>
                   <v:formulas>
@@ -176,7 +179,6 @@
         <w:spacing w:after="0" w:line="259" w:lineRule="auto"/>
         <w:ind w:left="0" w:firstLine="0"/>
       </w:pPr>
-      <w:proofErr w:type="gramStart"/>
       <w:r>
         <w:rPr>
           <w:rFonts w:ascii="Comic Sans MS" w:eastAsia="Comic Sans MS" w:hAnsi="Comic Sans MS" w:cs="Comic Sans MS"/>
@@ -191,7 +193,6 @@
         </w:rPr>
         <w:t></w:t>
       </w:r>
-      <w:proofErr w:type="gramEnd"/>
       <w:r>
         <w:rPr>
           <w:rFonts w:ascii="Comic Sans MS" w:eastAsia="Comic Sans MS" w:hAnsi="Comic Sans MS" w:cs="Comic Sans MS"/>
@@ -240,24 +241,15 @@
           <w:color w:val="0033CC"/>
           <w:sz w:val="16"/>
         </w:rPr>
-        <w:t xml:space="preserve">1. SC 1911 Heiligenstadt e.V. • Leineberg 2 • 37308 Heiligenstadt </w:t>
-      </w:r>
-      <w:proofErr w:type="gramStart"/>
+        <w:t xml:space="preserve">1. SC 1911 Heiligenstadt e.V. • Leineberg 2 • 37308 Heiligenstadt •  </w:t>
+      </w:r>
       <w:r>
         <w:rPr>
           <w:color w:val="0033CC"/>
           <w:sz w:val="16"/>
         </w:rPr>
-        <w:t xml:space="preserve">•  </w:t>
-      </w:r>
-      <w:r>
-        <w:rPr>
-          <w:color w:val="0033CC"/>
-          <w:sz w:val="16"/>
-        </w:rPr>
         <w:tab/>
       </w:r>
-      <w:proofErr w:type="gramEnd"/>
       <w:r>
         <w:rPr>
           <w:rFonts w:ascii="Wingdings" w:eastAsia="Wingdings" w:hAnsi="Wingdings" w:cs="Wingdings"/>
@@ -426,7 +418,6 @@
         <w:spacing w:after="0" w:line="259" w:lineRule="auto"/>
         <w:ind w:left="0" w:firstLine="0"/>
       </w:pPr>
-      <w:proofErr w:type="gramStart"/>
       <w:r>
         <w:rPr>
           <w:b/>
@@ -441,7 +432,6 @@
         </w:rPr>
         <w:tab/>
       </w:r>
-      <w:proofErr w:type="gramEnd"/>
       <w:r>
         <w:rPr>
           <w:rFonts w:ascii="Tahoma" w:eastAsia="Tahoma" w:hAnsi="Tahoma" w:cs="Tahoma"/>
@@ -1187,15 +1177,13 @@
         <w:ind w:left="-14" w:right="550"/>
       </w:pPr>
       <w:r>
-        <w:t xml:space="preserve">Der Verein weist den Übungsleiter darauf hin, dass Einnahmen aus </w:t>
-      </w:r>
-      <w:proofErr w:type="gramStart"/>
-      <w:r>
-        <w:t>Tätigkeiten  als</w:t>
-      </w:r>
-      <w:proofErr w:type="gramEnd"/>
-      <w:r>
-        <w:t xml:space="preserve"> nebenberuflicher Übungsleiter/Trainer/Ausbilder/Erzieher/Betreuer oder einer vergleichbaren Tätigkeit nur bis zu einer Höhe von insgesamt 3.000 EUR im Kalenderjahr steuerfrei und in der Sozialversicherung nicht beitrags- und meldepflichtig sind. </w:t>
+        <w:t>Der Verein weist den Übungsleiter darauf hin, dass Einnahmen aus Tätigkeiten</w:t>
+      </w:r>
+      <w:r>
+        <w:t xml:space="preserve"> </w:t>
+      </w:r>
+      <w:r>
+        <w:t xml:space="preserve">als nebenberuflicher Übungsleiter/Trainer/Ausbilder/Erzieher/Betreuer oder einer vergleichbaren Tätigkeit nur bis zu einer Höhe von insgesamt 3.000 EUR im Kalenderjahr steuerfrei und in der Sozialversicherung nicht beitrags- und meldepflichtig sind. </w:t>
       </w:r>
     </w:p>
     <w:p>
@@ -1290,8 +1278,8 @@
           <w:noProof/>
         </w:rPr>
         <w:drawing>
-          <wp:inline distT="0" distB="0" distL="0" distR="0" wp14:anchorId="2C6552C8" wp14:editId="46259D18">
-            <wp:extent cx="2273808" cy="742188"/>
+          <wp:inline distT="0" distB="0" distL="0" distR="0" wp14:anchorId="2C6552C8" wp14:editId="64EA6D12">
+            <wp:extent cx="2234152" cy="762000"/>
             <wp:effectExtent l="0" t="0" r="0" b="0"/>
             <wp:docPr id="290" name="Picture 290"/>
             <wp:cNvGraphicFramePr/>
@@ -1311,7 +1299,7 @@
                   <pic:spPr>
                     <a:xfrm>
                       <a:off x="0" y="0"/>
-                      <a:ext cx="2273808" cy="742188"/>
+                      <a:ext cx="2238870" cy="763609"/>
                     </a:xfrm>
                     <a:prstGeom prst="rect">
                       <a:avLst/>
@@ -1385,35 +1373,34 @@
         <w:spacing w:after="1" w:line="259" w:lineRule="auto"/>
         <w:ind w:left="-5" w:hanging="10"/>
       </w:pPr>
-      <w:proofErr w:type="gramStart"/>
       <w:r>
         <w:rPr>
           <w:b/>
           <w:i/>
         </w:rPr>
-        <w:t>Hinweise  zur</w:t>
-      </w:r>
-      <w:proofErr w:type="gramEnd"/>
+        <w:t xml:space="preserve">Hinweise  zur Befreiung von der Steuer- und Sozialversicherungspflicht </w:t>
+      </w:r>
+    </w:p>
+    <w:p>
+      <w:pPr>
+        <w:pStyle w:val="berschrift1"/>
+        <w:ind w:left="-5"/>
+      </w:pPr>
+      <w:r>
+        <w:t xml:space="preserve">und  zur gesetzlichen Unfallversicherung </w:t>
+      </w:r>
+    </w:p>
+    <w:p>
+      <w:pPr>
+        <w:spacing w:after="0" w:line="259" w:lineRule="auto"/>
+        <w:ind w:left="0" w:firstLine="0"/>
+      </w:pPr>
       <w:r>
         <w:rPr>
           <w:b/>
           <w:i/>
         </w:rPr>
-        <w:t xml:space="preserve"> Befreiung von der Steuer- und Sozialversicherungspflicht </w:t>
-      </w:r>
-    </w:p>
-    <w:p>
-      <w:pPr>
-        <w:pStyle w:val="berschrift1"/>
-        <w:ind w:left="-5"/>
-      </w:pPr>
-      <w:proofErr w:type="gramStart"/>
-      <w:r>
-        <w:t>und  zur</w:t>
-      </w:r>
-      <w:proofErr w:type="gramEnd"/>
-      <w:r>
-        <w:t xml:space="preserve"> gesetzlichen Unfallversicherung </w:t>
+        <w:t xml:space="preserve">   </w:t>
       </w:r>
     </w:p>
     <w:p>
@@ -1426,19 +1413,6 @@
           <w:b/>
           <w:i/>
         </w:rPr>
-        <w:t xml:space="preserve">   </w:t>
-      </w:r>
-    </w:p>
-    <w:p>
-      <w:pPr>
-        <w:spacing w:after="0" w:line="259" w:lineRule="auto"/>
-        <w:ind w:left="0" w:firstLine="0"/>
-      </w:pPr>
-      <w:r>
-        <w:rPr>
-          <w:b/>
-          <w:i/>
-        </w:rPr>
         <w:t xml:space="preserve"> </w:t>
       </w:r>
     </w:p>
@@ -1655,7 +1629,7 @@
         <w:rPr>
           <w:bdr w:val="single" w:sz="8" w:space="0" w:color="000000"/>
         </w:rPr>
-        <w:t xml:space="preserve">{{CHECK_KEINE}}</w:t>
+        <w:t>{{CHECK_KEINE}}</w:t>
       </w:r>
       <w:r>
         <w:t xml:space="preserve">    Ich erkläre, dass ich </w:t>
@@ -1667,7 +1641,13 @@
         <w:t>keine</w:t>
       </w:r>
       <w:r>
-        <w:t xml:space="preserve"> anderen Einnahmen aus nebenberuflichen Tätigkeiten im            Sinne des § 3 Nr. 26 EStG im Kalenderjahr</w:t>
+        <w:t xml:space="preserve"> anderen Einnahmen aus nebenberuflichen Tätigkeiten im</w:t>
+      </w:r>
+      <w:r>
+        <w:t xml:space="preserve"> </w:t>
+      </w:r>
+      <w:r>
+        <w:t>Sinne des § 3 Nr. 26 EStG im Kalenderjahr</w:t>
       </w:r>
       <w:r>
         <w:rPr>
@@ -1734,18 +1714,28 @@
         <w:rPr>
           <w:bdr w:val="single" w:sz="8" w:space="0" w:color="000000"/>
         </w:rPr>
-        <w:t xml:space="preserve">{{CHECK_ANDERE}}</w:t>
-      </w:r>
-      <w:r>
-        <w:t xml:space="preserve">    Ich erkläre, dass ich Einnahmen aus einer anderen nebenberuflichen Tätigkeit im            Sinne des § 3 Nr. 26 </w:t>
-      </w:r>
-      <w:proofErr w:type="gramStart"/>
-      <w:r>
-        <w:t>EStG  (</w:t>
-      </w:r>
-      <w:proofErr w:type="gramEnd"/>
-      <w:r>
-        <w:t xml:space="preserve">z.B. als Übungsleiter/Betreuer für einen anderen Verein)            in Höhe von {{NEBENTAETIGKEIT_BETRAG}} in Anspruch genommen habe bzw. in Anspruch            nehmen werde. </w:t>
+        <w:t>{{CHECK_ANDERE}}</w:t>
+      </w:r>
+      <w:r>
+        <w:t xml:space="preserve">    Ich erkläre, dass ich Einnahmen aus einer anderen nebenberuflichen Tätigkeit im</w:t>
+      </w:r>
+      <w:r>
+        <w:t xml:space="preserve"> </w:t>
+      </w:r>
+      <w:r>
+        <w:t>Sinne des § 3 Nr. 26 EStG  (z.B. als Übungsleiter/Betreuer für einen anderen Verein)</w:t>
+      </w:r>
+      <w:r>
+        <w:t xml:space="preserve"> </w:t>
+      </w:r>
+      <w:r>
+        <w:t>in Höhe von {{NEBENTAETIGKEIT_BETRAG}} in Anspruch genommen habe bzw. in Anspruch</w:t>
+      </w:r>
+      <w:r>
+        <w:t xml:space="preserve"> </w:t>
+      </w:r>
+      <w:r>
+        <w:t xml:space="preserve">nehmen werde. </w:t>
       </w:r>
     </w:p>
     <w:p>
@@ -2552,6 +2542,7 @@
   <w:style w:type="character" w:default="1" w:styleId="Absatz-Standardschriftart">
     <w:name w:val="Default Paragraph Font"/>
     <w:uiPriority w:val="1"/>
+    <w:semiHidden/>
     <w:unhideWhenUsed/>
   </w:style>
   <w:style w:type="table" w:default="1" w:styleId="NormaleTabelle">

</xml_diff>